<commit_message>
Deploying to gh-pages from @ Morrison-Lab/rme@68071bcdabc79b249a7ed27e4c76d858382c921b 🚀
</commit_message>
<xml_diff>
--- a/chapters/common-mistakes-handout.docx
+++ b/chapters/common-mistakes-handout.docx
@@ -1300,7 +1300,7 @@
       </w:r>
     </w:p>
     <w:bookmarkEnd w:id="9"/>
-    <w:bookmarkStart w:id="13" w:name="parameters-versus-random-variables"/>
+    <w:bookmarkStart w:id="15" w:name="parameters-versus-random-variables"/>
     <w:p>
       <w:pPr>
         <w:pStyle w:val="Heading1"/>
@@ -1314,7 +1314,24 @@
         <w:pStyle w:val="FirstParagraph"/>
       </w:pPr>
       <w:r>
-        <w:t xml:space="preserve">The parameters of a probability distribution shouldn’t involve the random variables being modeled:</w:t>
+        <w:t xml:space="preserve">The parameters of a probability distribution shouldn’t involve the</w:t>
+      </w:r>
+      <w:r>
+        <w:t xml:space="preserve"> </w:t>
+      </w:r>
+      <w:hyperlink r:id="rId10">
+        <w:r>
+          <w:rPr>
+            <w:rStyle w:val="Hyperlink"/>
+          </w:rPr>
+          <w:t xml:space="preserve">random variables</w:t>
+        </w:r>
+      </w:hyperlink>
+      <w:r>
+        <w:t xml:space="preserve"> </w:t>
+      </w:r>
+      <w:r>
+        <w:t xml:space="preserve">being modeled:</w:t>
       </w:r>
     </w:p>
     <w:tbl>
@@ -1358,18 +1375,18 @@
                 <wp:inline>
                   <wp:extent cx="152400" cy="152400"/>
                   <wp:effectExtent b="0" l="0" r="0" t="0"/>
-                  <wp:docPr descr="" title="" id="11" name="Picture"/>
+                  <wp:docPr descr="" title="" id="12" name="Picture"/>
                   <a:graphic>
                     <a:graphicData uri="http://schemas.openxmlformats.org/drawingml/2006/picture">
                       <pic:pic>
                         <pic:nvPicPr>
-                          <pic:cNvPr descr="/opt/quarto/share/formats/docx/warning.png" id="12" name="Picture"/>
+                          <pic:cNvPr descr="/opt/quarto/share/formats/docx/warning.png" id="13" name="Picture"/>
                           <pic:cNvPicPr>
                             <a:picLocks noChangeArrowheads="1" noChangeAspect="1"/>
                           </pic:cNvPicPr>
                         </pic:nvPicPr>
                         <pic:blipFill>
-                          <a:blip r:embed="rId10"/>
+                          <a:blip r:embed="rId11"/>
                           <a:stretch>
                             <a:fillRect/>
                           </a:stretch>
@@ -1738,8 +1755,19 @@
       <w:pPr>
         <w:pStyle w:val="FirstParagraph"/>
       </w:pPr>
-      <w:r>
-        <w:t xml:space="preserve">Expectations are means, not sums, despite the similarity of</w:t>
+      <w:hyperlink r:id="rId14">
+        <w:r>
+          <w:rPr>
+            <w:rStyle w:val="Hyperlink"/>
+          </w:rPr>
+          <w:t xml:space="preserve">Expectations</w:t>
+        </w:r>
+      </w:hyperlink>
+      <w:r>
+        <w:t xml:space="preserve"> </w:t>
+      </w:r>
+      <w:r>
+        <w:t xml:space="preserve">are means, not sums, despite the similarity of</w:t>
       </w:r>
       <w:r>
         <w:t xml:space="preserve"> </w:t>
@@ -1809,8 +1837,8 @@
         <w:t xml:space="preserve">.</w:t>
       </w:r>
     </w:p>
-    <w:bookmarkEnd w:id="13"/>
-    <w:bookmarkStart w:id="16" w:name="r"/>
+    <w:bookmarkEnd w:id="15"/>
+    <w:bookmarkStart w:id="18" w:name="r"/>
     <w:p>
       <w:pPr>
         <w:pStyle w:val="Heading1"/>
@@ -1819,7 +1847,7 @@
         <w:t xml:space="preserve">2. R</w:t>
       </w:r>
     </w:p>
-    <w:bookmarkStart w:id="15" w:name="dont-copy-paste-code"/>
+    <w:bookmarkStart w:id="17" w:name="dont-copy-paste-code"/>
     <w:p>
       <w:pPr>
         <w:pStyle w:val="Heading2"/>
@@ -1838,7 +1866,7 @@
       <w:r>
         <w:t xml:space="preserve"> </w:t>
       </w:r>
-      <w:hyperlink r:id="rId14">
+      <w:hyperlink r:id="rId16">
         <w:r>
           <w:rPr>
             <w:rStyle w:val="Hyperlink"/>
@@ -1847,9 +1875,9 @@
         </w:r>
       </w:hyperlink>
     </w:p>
-    <w:bookmarkEnd w:id="15"/>
-    <w:bookmarkEnd w:id="16"/>
-    <w:bookmarkStart w:id="20" w:name="quarto"/>
+    <w:bookmarkEnd w:id="17"/>
+    <w:bookmarkEnd w:id="18"/>
+    <w:bookmarkStart w:id="22" w:name="quarto"/>
     <w:p>
       <w:pPr>
         <w:pStyle w:val="Heading1"/>
@@ -1858,7 +1886,7 @@
         <w:t xml:space="preserve">3. Quarto</w:t>
       </w:r>
     </w:p>
-    <w:bookmarkStart w:id="17" w:name="separate-divs-and-slide-breaks"/>
+    <w:bookmarkStart w:id="19" w:name="separate-divs-and-slide-breaks"/>
     <w:p>
       <w:pPr>
         <w:pStyle w:val="Heading2"/>
@@ -1971,8 +1999,8 @@
         <w:t xml:space="preserve">:::</w:t>
       </w:r>
     </w:p>
-    <w:bookmarkEnd w:id="17"/>
-    <w:bookmarkStart w:id="19" w:name="Xee27ee22b453f6e92c33220154e424fa6bac318"/>
+    <w:bookmarkEnd w:id="19"/>
+    <w:bookmarkStart w:id="21" w:name="Xee27ee22b453f6e92c33220154e424fa6bac318"/>
     <w:p>
       <w:pPr>
         <w:pStyle w:val="Heading2"/>
@@ -2015,7 +2043,7 @@
       <w:r>
         <w:t xml:space="preserve"> </w:t>
       </w:r>
-      <w:hyperlink r:id="rId18">
+      <w:hyperlink r:id="rId20">
         <w:r>
           <w:rPr>
             <w:rStyle w:val="Hyperlink"/>
@@ -2024,9 +2052,9 @@
         </w:r>
       </w:hyperlink>
     </w:p>
-    <w:bookmarkEnd w:id="19"/>
-    <w:bookmarkEnd w:id="20"/>
-    <w:bookmarkStart w:id="22" w:name="latex"/>
+    <w:bookmarkEnd w:id="21"/>
+    <w:bookmarkEnd w:id="22"/>
+    <w:bookmarkStart w:id="24" w:name="latex"/>
     <w:p>
       <w:pPr>
         <w:pStyle w:val="Heading1"/>
@@ -2096,7 +2124,7 @@
       <w:r>
         <w:t xml:space="preserve"> </w:t>
       </w:r>
-      <w:hyperlink r:id="rId21">
+      <w:hyperlink r:id="rId23">
         <w:r>
           <w:rPr>
             <w:rStyle w:val="Hyperlink"/>
@@ -2105,7 +2133,7 @@
         </w:r>
       </w:hyperlink>
     </w:p>
-    <w:bookmarkEnd w:id="22"/>
+    <w:bookmarkEnd w:id="24"/>
     <w:sectPr>
       <w:footnotePr>
         <w:numRestart w:val="eachSect"/>

</xml_diff>